<commit_message>
Document Chai-1 complex prediction settings
</commit_message>
<xml_diff>
--- a/method.docx
+++ b/method.docx
@@ -34,7 +34,7 @@
           <w:rFonts w:ascii="Times New Roman" w:hAnsi="Times New Roman"/>
           <w:sz w:val="21"/>
         </w:rPr>
-        <w:t>The simulated protein system consisted of a synthetic trimer assembled from three identical 1-27-residue peptide chains. The initial protein-ligand complex was prepared from the docking-derived binding pose. The protein coordinates were extracted and saved as 7f01.pdb. The ligand coordinates were extracted from the docking result, protonated using UCSF ChimeraX, and saved as mol2 files for subsequent molecular dynamics preparation.</w:t>
+        <w:t>The initial protein-ligand complex was generated using Chai-1. The protein input consisted of three identical peptide chains, each with the sequence PPGPPGQRGREGPMGPRGPPGPPGPPG. The ligand inputs were provided as SMILES strings: CA, OC(=O)CC(O)(C(=O)O)CC(=O)O, and LYS, OC(=O)[C@@H](N)CCCCN. Multiple sequence alignment was enabled using the UniRef database, and monomer MSA was enabled. Complex prediction was performed using 10 samples, 5 trunk recycles, and 3 trunk samples with a random seed of 1963939445. Among the generated Chai-1 models, the top-ranked protein-ligand complex was selected as the starting structure for molecular dynamics preparation.</w:t>
       </w:r>
     </w:p>
     <w:p>
@@ -47,18 +47,7 @@
           <w:rFonts w:ascii="Times New Roman" w:hAnsi="Times New Roman"/>
           <w:sz w:val="21"/>
         </w:rPr>
-        <w:t>Protein topology was generated using GROMACS with the AMBER99SB-ILDN force field and the TIP3P water model. Only standard protein residues were retained before topology generation, and hydrogen atoms were rebuilt during gmx pdb2gmx using the -ignh option. Ligand topologies were generated using ACPYPE/Antechamber with GAFF2 atom types and AM1-BCC partial charges. According to the modeled protonation states, the net charges of CA1 and LYS1 were assigned as -3 and +1, respectively. The ligand topologies were then incorporated into the protein topology to generate the final protein-CA1-LYS1 complex.</w:t>
-      </w:r>
-    </w:p>
-    <w:p>
-      <w:pPr>
-        <w:pStyle w:val="Heading2"/>
-      </w:pPr>
-      <w:r>
-        <w:rPr>
-          <w:rFonts w:ascii="Times New Roman" w:hAnsi="Times New Roman"/>
-        </w:rPr>
-        <w:t>System construction and equilibration</w:t>
+        <w:t>The protein coordinates were extracted from the selected Chai-1 complex and saved as 7f01.pdb. The ligand coordinates were extracted from the same complex, protonated using UCSF ChimeraX, and saved as mol2 files for subsequent molecular dynamics preparation. This Chai-1-derived structure was used only as the initial surface-associated pose; the persistence and dynamics of protein-ligand association were evaluated by the subsequent MD simulations.</w:t>
       </w:r>
     </w:p>
     <w:p>
@@ -71,7 +60,18 @@
           <w:rFonts w:ascii="Times New Roman" w:hAnsi="Times New Roman"/>
           <w:sz w:val="21"/>
         </w:rPr>
-        <w:t>The protein-ligand complex was centered in a triclinic simulation box with a minimum solute-box distance of 1.8 nm. The system was solvated with TIP3P water, neutralized with Na+ and Cl- ions, and supplemented with 0.15 M NaCl. Periodic boundary conditions were applied in all three dimensions.</w:t>
+        <w:t>Protein topology was generated using GROMACS with the AMBER99SB-ILDN force field and the TIP3P water model. Only standard protein residues were retained before topology generation, and hydrogen atoms were rebuilt during gmx pdb2gmx using the -ignh option. Ligand topologies were generated using ACPYPE/Antechamber with GAFF2 atom types and AM1-BCC partial charges. According to the modeled protonation states, the net charges of CA1 and LYS1 were assigned as -3 and +1, respectively. The ligand topologies were then incorporated into the protein topology to generate the final protein-CA1-LYS1 complex.</w:t>
+      </w:r>
+    </w:p>
+    <w:p>
+      <w:pPr>
+        <w:pStyle w:val="Heading2"/>
+      </w:pPr>
+      <w:r>
+        <w:rPr>
+          <w:rFonts w:ascii="Times New Roman" w:hAnsi="Times New Roman"/>
+        </w:rPr>
+        <w:t>System construction and equilibration</w:t>
       </w:r>
     </w:p>
     <w:p>
@@ -84,7 +84,7 @@
           <w:rFonts w:ascii="Times New Roman" w:hAnsi="Times New Roman"/>
           <w:sz w:val="21"/>
         </w:rPr>
-        <w:t>The solvated system was first subjected to steepest-descent energy minimization with a maximum force tolerance of 1000 kJ mol-1 nm-1, an energy step size of 0.01 nm, and a maximum of 50,000 steps. A second, stricter minimization was then performed from the minimized structure using conjugate-gradient minimization with a maximum force tolerance of 100 kJ mol-1 nm-1, an energy step size of 0.0005 nm, and up to 50,000 steps. When necessary, an additional steepest-descent rescue minimization was applied before the second minimization step to remove residual unfavorable contacts.</w:t>
+        <w:t>The protein-ligand complex was centered in a triclinic simulation box with a minimum solute-box distance of 1.8 nm. The system was solvated with TIP3P water, neutralized with Na+ and Cl- ions, and supplemented with 0.15 M NaCl. Periodic boundary conditions were applied in all three dimensions.</w:t>
       </w:r>
     </w:p>
     <w:p>
@@ -97,7 +97,20 @@
           <w:rFonts w:ascii="Times New Roman" w:hAnsi="Times New Roman"/>
           <w:sz w:val="21"/>
         </w:rPr>
-        <w:t>Three independent replicas were generated using different random seeds. Each replica was equilibrated for 100 ps under NVT conditions followed by 100 ps under NPT conditions with a 2 fs integration time step. During equilibration, ligand position restraints were applied with a force constant of 1000 kJ mol-1 nm-2 to maintain the docking-derived starting arrangement while allowing solvent and local environmental relaxation. Temperature was maintained at 310 K using the V-rescale thermostat with separate coupling groups for the protein-ligand complex and water/ions. NPT equilibration was performed using isotropic Berendsen pressure coupling at 1 bar with a coupling time constant of 2.0 ps and a compressibility of 4.5 x 10-5 bar-1.</w:t>
+        <w:t>The solvated system was first subjected to steepest-descent energy minimization with a maximum force tolerance of 1000 kJ mol-1 nm-1, an energy step size of 0.01 nm, and a maximum of 50,000 steps. A second, stricter minimization was then performed from the minimized structure using conjugate-gradient minimization with a maximum force tolerance of 100 kJ mol-1 nm-1, an energy step size of 0.0005 nm, and up to 50,000 steps. When necessary, an additional steepest-descent rescue minimization was applied before the second minimization step to remove residual unfavorable contacts.</w:t>
+      </w:r>
+    </w:p>
+    <w:p>
+      <w:pPr>
+        <w:spacing w:after="120" w:line="269" w:lineRule="auto"/>
+        <w:ind w:firstLine="288"/>
+      </w:pPr>
+      <w:r>
+        <w:rPr>
+          <w:rFonts w:ascii="Times New Roman" w:hAnsi="Times New Roman"/>
+          <w:sz w:val="21"/>
+        </w:rPr>
+        <w:t>Three independent replicas were generated using different random seeds. Each replica was equilibrated for 100 ps under NVT conditions followed by 100 ps under NPT conditions with a 2 fs integration time step. During equilibration, ligand position restraints were applied with a force constant of 1000 kJ mol-1 nm-2 to maintain the Chai-1-derived starting arrangement while allowing solvent and local environmental relaxation. Temperature was maintained at 310 K using the V-rescale thermostat with separate coupling groups for the protein-ligand complex and water/ions. NPT equilibration was performed using isotropic Berendsen pressure coupling at 1 bar with a coupling time constant of 2.0 ps and a compressibility of 4.5 x 10-5 bar-1.</w:t>
       </w:r>
     </w:p>
     <w:p>

</xml_diff>